<commit_message>
Job portal only: add auth, dashboard, skills, admin; dynamic job-detail with notification/docs tabs; remove tenders + OJAS, apply goes to respective official URLs
</commit_message>
<xml_diff>
--- a/docs/GYRS_Client_Document.docx
+++ b/docs/GYRS_Client_Document.docx
@@ -500,7 +500,7 @@
                 <w:color w:val="1E293B"/>
                 <w:sz w:val="18"/>
               </w:rPr>
-              <w:t>Laravel 11 + Livewire 3 + Tailwind CSS + MySQL 8</w:t>
+              <w:t>Laravel 11 + Livewire 3 + Supabase Cloud DB (PostgreSQL 16) + Tailwind CSS</w:t>
             </w:r>
           </w:p>
         </w:tc>
@@ -899,7 +899,7 @@
           <w:color w:val="334155"/>
           <w:sz w:val="20"/>
         </w:rPr>
-        <w:t>The technology stack has been selected to ensure maximum Search Engine Optimization (SEO) for vernacular Gujarati search terms, microsecond page delivery on low-bandwidth rural mobile networks, low maintenance overhead for non-technical administrative staff, and enterprise reliability.</w:t>
+        <w:t>The technology stack has been selected to ensure maximum Search Engine Optimization (SEO) for vernacular Gujarati search terms, microsecond page delivery on low-bandwidth rural mobile networks, high-availability cloud database scaling, low maintenance overhead, and enterprise reliability.</w:t>
       </w:r>
     </w:p>
     <w:tbl>
@@ -1348,7 +1348,7 @@
                 <w:color w:val="1E293B"/>
                 <w:sz w:val="18"/>
               </w:rPr>
-              <w:t>Database Engine</w:t>
+              <w:t>Cloud Database</w:t>
             </w:r>
           </w:p>
         </w:tc>
@@ -1373,7 +1373,7 @@
                 <w:color w:val="1E293B"/>
                 <w:sz w:val="18"/>
               </w:rPr>
-              <w:t>MySQL Server</w:t>
+              <w:t>Supabase Cloud (PostgreSQL)</w:t>
             </w:r>
           </w:p>
         </w:tc>
@@ -1398,7 +1398,7 @@
                 <w:color w:val="1E293B"/>
                 <w:sz w:val="18"/>
               </w:rPr>
-              <w:t>8.0 (InnoDB, utf8mb4)</w:t>
+              <w:t>PostgreSQL 16 + Supavisor</w:t>
             </w:r>
           </w:p>
         </w:tc>
@@ -1423,7 +1423,7 @@
                 <w:color w:val="1E293B"/>
                 <w:sz w:val="18"/>
               </w:rPr>
-              <w:t>ACID compliance, full Unicode support for native Gujarati typography, spatial district indices, and high read concurrency.</w:t>
+              <w:t>Enterprise-grade managed cloud database with connection pooling, automated failover, point-in-time recovery (PITR) backups, native JSONB for syllabi, and spatial district indexing.</w:t>
             </w:r>
           </w:p>
         </w:tc>
@@ -1450,7 +1450,7 @@
                 <w:color w:val="1E293B"/>
                 <w:sz w:val="18"/>
               </w:rPr>
-              <w:t>Cache &amp; Queue</w:t>
+              <w:t>Cloud Object Storage</w:t>
             </w:r>
           </w:p>
         </w:tc>
@@ -1475,7 +1475,7 @@
                 <w:color w:val="1E293B"/>
                 <w:sz w:val="18"/>
               </w:rPr>
-              <w:t>Redis</w:t>
+              <w:t>Supabase Storage (S3 API)</w:t>
             </w:r>
           </w:p>
         </w:tc>
@@ -1500,7 +1500,7 @@
                 <w:color w:val="1E293B"/>
                 <w:sz w:val="18"/>
               </w:rPr>
-              <w:t>7.2 Alpine</w:t>
+              <w:t>Global CDN Buckets</w:t>
             </w:r>
           </w:p>
         </w:tc>
@@ -1525,7 +1525,7 @@
                 <w:color w:val="1E293B"/>
                 <w:sz w:val="18"/>
               </w:rPr>
-              <w:t>In-memory caching of gazette feeds, rate limiting, and queue management for asynchronous WhatsApp and transactional email workers.</w:t>
+              <w:t>Encrypted cloud object storage for official OJAS recruitment gazette PDFs, syllabus documents, and candidate document checklists.</w:t>
             </w:r>
           </w:p>
         </w:tc>
@@ -1552,7 +1552,7 @@
                 <w:color w:val="1E293B"/>
                 <w:sz w:val="18"/>
               </w:rPr>
-              <w:t>Authentication &amp; RBAC</w:t>
+              <w:t>Realtime &amp; Webhooks</w:t>
             </w:r>
           </w:p>
         </w:tc>
@@ -1577,7 +1577,7 @@
                 <w:color w:val="1E293B"/>
                 <w:sz w:val="18"/>
               </w:rPr>
-              <w:t>Laravel Breeze + Spatie</w:t>
+              <w:t>Supabase Realtime &amp; CDC</w:t>
             </w:r>
           </w:p>
         </w:tc>
@@ -1602,7 +1602,7 @@
                 <w:color w:val="1E293B"/>
                 <w:sz w:val="18"/>
               </w:rPr>
-              <w:t>spatie/laravel-permission</w:t>
+              <w:t>PostgreSQL WAL Webhooks</w:t>
             </w:r>
           </w:p>
         </w:tc>
@@ -1627,7 +1627,7 @@
                 <w:color w:val="1E293B"/>
                 <w:sz w:val="18"/>
               </w:rPr>
-              <w:t>Role-Based Access Control enforcing strict separation between Super Admins, Content Editors, and Candidates.</w:t>
+              <w:t>Instant database event triggers firing background queues for WhatsApp and Email notifications whenever a new job is published or deadlines approach.</w:t>
             </w:r>
           </w:p>
         </w:tc>
@@ -1654,7 +1654,7 @@
                 <w:color w:val="1E293B"/>
                 <w:sz w:val="18"/>
               </w:rPr>
-              <w:t>Notification Gateway</w:t>
+              <w:t>Cache &amp; Queue</w:t>
             </w:r>
           </w:p>
         </w:tc>
@@ -1679,7 +1679,7 @@
                 <w:color w:val="1E293B"/>
                 <w:sz w:val="18"/>
               </w:rPr>
-              <w:t>Interakt / Gupshup / WATI</w:t>
+              <w:t>Redis Cloud</w:t>
             </w:r>
           </w:p>
         </w:tc>
@@ -1704,7 +1704,7 @@
                 <w:color w:val="1E293B"/>
                 <w:sz w:val="18"/>
               </w:rPr>
-              <w:t>WhatsApp Cloud Business API</w:t>
+              <w:t>7.2 Alpine</w:t>
             </w:r>
           </w:p>
         </w:tc>
@@ -1729,7 +1729,7 @@
                 <w:color w:val="1E293B"/>
                 <w:sz w:val="18"/>
               </w:rPr>
-              <w:t>Official WhatsApp Business API templates for instant candidate notifications with 98% open rates.</w:t>
+              <w:t>In-memory caching of gazette feeds, rate limiting, and queue management for asynchronous WhatsApp and transactional email workers.</w:t>
             </w:r>
           </w:p>
         </w:tc>
@@ -1756,7 +1756,7 @@
                 <w:color w:val="1E293B"/>
                 <w:sz w:val="18"/>
               </w:rPr>
-              <w:t>Transactional Email</w:t>
+              <w:t>Authentication &amp; RBAC</w:t>
             </w:r>
           </w:p>
         </w:tc>
@@ -1781,7 +1781,7 @@
                 <w:color w:val="1E293B"/>
                 <w:sz w:val="18"/>
               </w:rPr>
-              <w:t>Brevo / AWS SES</w:t>
+              <w:t>Laravel Breeze + Spatie</w:t>
             </w:r>
           </w:p>
         </w:tc>
@@ -1806,7 +1806,7 @@
                 <w:color w:val="1E293B"/>
                 <w:sz w:val="18"/>
               </w:rPr>
-              <w:t>SMTP Mailables</w:t>
+              <w:t>spatie/laravel-permission</w:t>
             </w:r>
           </w:p>
         </w:tc>
@@ -1831,7 +1831,7 @@
                 <w:color w:val="1E293B"/>
                 <w:sz w:val="18"/>
               </w:rPr>
-              <w:t>Reliable delivery for registration OTPs, profile notifications, and scheduled weekly recruitment digests.</w:t>
+              <w:t>Role-Based Access Control enforcing strict separation between Super Admins, Content Editors, and Candidates.</w:t>
             </w:r>
           </w:p>
         </w:tc>
@@ -1858,7 +1858,7 @@
                 <w:color w:val="1E293B"/>
                 <w:sz w:val="18"/>
               </w:rPr>
-              <w:t>Deployment &amp; CDN</w:t>
+              <w:t>Notification Gateway</w:t>
             </w:r>
           </w:p>
         </w:tc>
@@ -1883,7 +1883,7 @@
                 <w:color w:val="1E293B"/>
                 <w:sz w:val="18"/>
               </w:rPr>
-              <w:t>Hetzner VPS + Cloudflare</w:t>
+              <w:t>Interakt / Gupshup / WATI</w:t>
             </w:r>
           </w:p>
         </w:tc>
@@ -1908,7 +1908,7 @@
                 <w:color w:val="1E293B"/>
                 <w:sz w:val="18"/>
               </w:rPr>
-              <w:t>Nginx + PHP-FPM + SSL</w:t>
+              <w:t>WhatsApp Cloud Business API</w:t>
             </w:r>
           </w:p>
         </w:tc>
@@ -1933,7 +1933,211 @@
                 <w:color w:val="1E293B"/>
                 <w:sz w:val="18"/>
               </w:rPr>
-              <w:t>Edge caching, DDoS protection, Web Application Firewall, and automated daily MySQL backups.</w:t>
+              <w:t>Official WhatsApp Business API templates for instant candidate notifications with 98% open rates.</w:t>
+            </w:r>
+          </w:p>
+        </w:tc>
+      </w:tr>
+      <w:tr>
+        <w:tc>
+          <w:tcPr>
+            <w:tcW w:type="dxa" w:w="2016"/>
+            <w:shd w:fill="F8FAFC"/>
+            <w:tcMar>
+              <w:top w:w="80" w:type="dxa"/>
+              <w:bottom w:w="80" w:type="dxa"/>
+              <w:left w:w="100" w:type="dxa"/>
+              <w:right w:w="100" w:type="dxa"/>
+            </w:tcMar>
+          </w:tcPr>
+          <w:p>
+            <w:pPr>
+              <w:jc w:val="left"/>
+            </w:pPr>
+            <w:r>
+              <w:rPr>
+                <w:rFonts w:ascii="Arial" w:hAnsi="Arial"/>
+                <w:color w:val="1E293B"/>
+                <w:sz w:val="18"/>
+              </w:rPr>
+              <w:t>Transactional Email</w:t>
+            </w:r>
+          </w:p>
+        </w:tc>
+        <w:tc>
+          <w:tcPr>
+            <w:tcW w:type="dxa" w:w="2592"/>
+            <w:shd w:fill="F8FAFC"/>
+            <w:tcMar>
+              <w:top w:w="80" w:type="dxa"/>
+              <w:bottom w:w="80" w:type="dxa"/>
+              <w:left w:w="100" w:type="dxa"/>
+              <w:right w:w="100" w:type="dxa"/>
+            </w:tcMar>
+          </w:tcPr>
+          <w:p>
+            <w:pPr>
+              <w:jc w:val="left"/>
+            </w:pPr>
+            <w:r>
+              <w:rPr>
+                <w:rFonts w:ascii="Arial" w:hAnsi="Arial"/>
+                <w:color w:val="1E293B"/>
+                <w:sz w:val="18"/>
+              </w:rPr>
+              <w:t>Brevo / AWS SES</w:t>
+            </w:r>
+          </w:p>
+        </w:tc>
+        <w:tc>
+          <w:tcPr>
+            <w:tcW w:type="dxa" w:w="2592"/>
+            <w:shd w:fill="F8FAFC"/>
+            <w:tcMar>
+              <w:top w:w="80" w:type="dxa"/>
+              <w:bottom w:w="80" w:type="dxa"/>
+              <w:left w:w="100" w:type="dxa"/>
+              <w:right w:w="100" w:type="dxa"/>
+            </w:tcMar>
+          </w:tcPr>
+          <w:p>
+            <w:pPr>
+              <w:jc w:val="left"/>
+            </w:pPr>
+            <w:r>
+              <w:rPr>
+                <w:rFonts w:ascii="Arial" w:hAnsi="Arial"/>
+                <w:color w:val="1E293B"/>
+                <w:sz w:val="18"/>
+              </w:rPr>
+              <w:t>SMTP Mailables</w:t>
+            </w:r>
+          </w:p>
+        </w:tc>
+        <w:tc>
+          <w:tcPr>
+            <w:tcW w:type="dxa" w:w="3168"/>
+            <w:shd w:fill="F8FAFC"/>
+            <w:tcMar>
+              <w:top w:w="80" w:type="dxa"/>
+              <w:bottom w:w="80" w:type="dxa"/>
+              <w:left w:w="100" w:type="dxa"/>
+              <w:right w:w="100" w:type="dxa"/>
+            </w:tcMar>
+          </w:tcPr>
+          <w:p>
+            <w:pPr>
+              <w:jc w:val="left"/>
+            </w:pPr>
+            <w:r>
+              <w:rPr>
+                <w:rFonts w:ascii="Arial" w:hAnsi="Arial"/>
+                <w:color w:val="1E293B"/>
+                <w:sz w:val="18"/>
+              </w:rPr>
+              <w:t>Reliable delivery for registration OTPs, profile notifications, and scheduled weekly recruitment digests.</w:t>
+            </w:r>
+          </w:p>
+        </w:tc>
+      </w:tr>
+      <w:tr>
+        <w:tc>
+          <w:tcPr>
+            <w:tcW w:type="dxa" w:w="2016"/>
+            <w:shd w:fill="FFFFFF"/>
+            <w:tcMar>
+              <w:top w:w="80" w:type="dxa"/>
+              <w:bottom w:w="80" w:type="dxa"/>
+              <w:left w:w="100" w:type="dxa"/>
+              <w:right w:w="100" w:type="dxa"/>
+            </w:tcMar>
+          </w:tcPr>
+          <w:p>
+            <w:pPr>
+              <w:jc w:val="left"/>
+            </w:pPr>
+            <w:r>
+              <w:rPr>
+                <w:rFonts w:ascii="Arial" w:hAnsi="Arial"/>
+                <w:color w:val="1E293B"/>
+                <w:sz w:val="18"/>
+              </w:rPr>
+              <w:t>Deployment &amp; Edge CDN</w:t>
+            </w:r>
+          </w:p>
+        </w:tc>
+        <w:tc>
+          <w:tcPr>
+            <w:tcW w:type="dxa" w:w="2592"/>
+            <w:shd w:fill="FFFFFF"/>
+            <w:tcMar>
+              <w:top w:w="80" w:type="dxa"/>
+              <w:bottom w:w="80" w:type="dxa"/>
+              <w:left w:w="100" w:type="dxa"/>
+              <w:right w:w="100" w:type="dxa"/>
+            </w:tcMar>
+          </w:tcPr>
+          <w:p>
+            <w:pPr>
+              <w:jc w:val="left"/>
+            </w:pPr>
+            <w:r>
+              <w:rPr>
+                <w:rFonts w:ascii="Arial" w:hAnsi="Arial"/>
+                <w:color w:val="1E293B"/>
+                <w:sz w:val="18"/>
+              </w:rPr>
+              <w:t>Cloudflare Enterprise Edge</w:t>
+            </w:r>
+          </w:p>
+        </w:tc>
+        <w:tc>
+          <w:tcPr>
+            <w:tcW w:type="dxa" w:w="2592"/>
+            <w:shd w:fill="FFFFFF"/>
+            <w:tcMar>
+              <w:top w:w="80" w:type="dxa"/>
+              <w:bottom w:w="80" w:type="dxa"/>
+              <w:left w:w="100" w:type="dxa"/>
+              <w:right w:w="100" w:type="dxa"/>
+            </w:tcMar>
+          </w:tcPr>
+          <w:p>
+            <w:pPr>
+              <w:jc w:val="left"/>
+            </w:pPr>
+            <w:r>
+              <w:rPr>
+                <w:rFonts w:ascii="Arial" w:hAnsi="Arial"/>
+                <w:color w:val="1E293B"/>
+                <w:sz w:val="18"/>
+              </w:rPr>
+              <w:t>Nginx + PHP-FPM + SSL</w:t>
+            </w:r>
+          </w:p>
+        </w:tc>
+        <w:tc>
+          <w:tcPr>
+            <w:tcW w:type="dxa" w:w="3168"/>
+            <w:shd w:fill="FFFFFF"/>
+            <w:tcMar>
+              <w:top w:w="80" w:type="dxa"/>
+              <w:bottom w:w="80" w:type="dxa"/>
+              <w:left w:w="100" w:type="dxa"/>
+              <w:right w:w="100" w:type="dxa"/>
+            </w:tcMar>
+          </w:tcPr>
+          <w:p>
+            <w:pPr>
+              <w:jc w:val="left"/>
+            </w:pPr>
+            <w:r>
+              <w:rPr>
+                <w:rFonts w:ascii="Arial" w:hAnsi="Arial"/>
+                <w:color w:val="1E293B"/>
+                <w:sz w:val="18"/>
+              </w:rPr>
+              <w:t>Edge caching, DDoS protection, Web Application Firewall, and automated daily cloud backup pipelines.</w:t>
             </w:r>
           </w:p>
         </w:tc>
@@ -1963,7 +2167,53 @@
           <w:color w:val="334155"/>
           <w:sz w:val="20"/>
         </w:rPr>
-        <w:t>Why Blade &amp; Livewire over Next.js/React SPA?</w:t>
+        <w:t>Why Supabase Cloud Database + Laravel Blade/Livewire?</w:t>
+      </w:r>
+    </w:p>
+    <w:p>
+      <w:pPr>
+        <w:pStyle w:val="ListBullet"/>
+        <w:spacing w:before="0" w:after="60" w:line="276" w:lineRule="auto"/>
+      </w:pPr>
+      <w:r>
+        <w:rPr>
+          <w:rFonts w:ascii="Arial" w:hAnsi="Arial"/>
+          <w:b/>
+          <w:color w:val="0F172A"/>
+          <w:sz w:val="20"/>
+        </w:rPr>
+        <w:t xml:space="preserve">Cloud Database Scalability: </w:t>
+      </w:r>
+      <w:r>
+        <w:rPr>
+          <w:rFonts w:ascii="Arial" w:hAnsi="Arial"/>
+          <w:color w:val="334155"/>
+          <w:sz w:val="20"/>
+        </w:rPr>
+        <w:t>By utilizing Supabase's managed PostgreSQL cloud infrastructure, the system eliminates traditional database maintenance overhead (manual patching, disk expansions, replica failures). Supabase provides built-in connection pooling (Supavisor) capable of supporting 10,000+ concurrent candidate queries during peak result release hours without connection pool starvation.</w:t>
+      </w:r>
+    </w:p>
+    <w:p>
+      <w:pPr>
+        <w:pStyle w:val="ListBullet"/>
+        <w:spacing w:before="0" w:after="60" w:line="276" w:lineRule="auto"/>
+      </w:pPr>
+      <w:r>
+        <w:rPr>
+          <w:rFonts w:ascii="Arial" w:hAnsi="Arial"/>
+          <w:b/>
+          <w:color w:val="0F172A"/>
+          <w:sz w:val="20"/>
+        </w:rPr>
+        <w:t xml:space="preserve">Managed Cloud Storage: </w:t>
+      </w:r>
+      <w:r>
+        <w:rPr>
+          <w:rFonts w:ascii="Arial" w:hAnsi="Arial"/>
+          <w:color w:val="334155"/>
+          <w:sz w:val="20"/>
+        </w:rPr>
+        <w:t>Supabase Storage delivers instant global CDN delivery for government gazette PDFs, ensuring rural applicants on 4G networks download notifications at microsecond latency.</w:t>
       </w:r>
     </w:p>
     <w:p>
@@ -1986,53 +2236,7 @@
           <w:color w:val="334155"/>
           <w:sz w:val="20"/>
         </w:rPr>
-        <w:t>Government job seekers frequently search specific regional phrases such as 'GSRTC helper bharti 2026', 'Talati exam syllabus gujarati pdf', or 'GSSSB junior clerk last date'. Laravel Blade delivers full server-side HTML rendering (SSR) natively, ensuring 100% indexing by Google, Bing, and vernacular search engines without hydration delays or complex SSR Node servers.</w:t>
-      </w:r>
-    </w:p>
-    <w:p>
-      <w:pPr>
-        <w:pStyle w:val="ListBullet"/>
-        <w:spacing w:before="0" w:after="60" w:line="276" w:lineRule="auto"/>
-      </w:pPr>
-      <w:r>
-        <w:rPr>
-          <w:rFonts w:ascii="Arial" w:hAnsi="Arial"/>
-          <w:b/>
-          <w:color w:val="0F172A"/>
-          <w:sz w:val="20"/>
-        </w:rPr>
-        <w:t xml:space="preserve">Development Velocity: </w:t>
-      </w:r>
-      <w:r>
-        <w:rPr>
-          <w:rFonts w:ascii="Arial" w:hAnsi="Arial"/>
-          <w:color w:val="334155"/>
-          <w:sz w:val="20"/>
-        </w:rPr>
-        <w:t>Livewire 3 provides real-time search filtering, dynamic dropdowns, and instant eligibility calculations via web sockets/XHR without writing thousands of lines of boilerplate React/Redux code. This drastically cuts maintenance costs and future development bugs.</w:t>
-      </w:r>
-    </w:p>
-    <w:p>
-      <w:pPr>
-        <w:pStyle w:val="ListBullet"/>
-        <w:spacing w:before="0" w:after="60" w:line="276" w:lineRule="auto"/>
-      </w:pPr>
-      <w:r>
-        <w:rPr>
-          <w:rFonts w:ascii="Arial" w:hAnsi="Arial"/>
-          <w:b/>
-          <w:color w:val="0F172A"/>
-          <w:sz w:val="20"/>
-        </w:rPr>
-        <w:t xml:space="preserve">Operational Efficiency: </w:t>
-      </w:r>
-      <w:r>
-        <w:rPr>
-          <w:rFonts w:ascii="Arial" w:hAnsi="Arial"/>
-          <w:color w:val="334155"/>
-          <w:sz w:val="20"/>
-        </w:rPr>
-        <w:t>A unified Laravel monolith requires only a single modest VPS (2 vCPU, 4GB RAM) capable of serving over 10,000 concurrent candidate visits behind Cloudflare page caching, saving thousands of dollars in server infrastructure.</w:t>
+        <w:t>Laravel Blade delivers full server-side HTML rendering (SSR) natively, ensuring 100% indexing by Google, Bing, and vernacular search engines for regional search queries like 'GSRTC helper bharti 2026' or 'GSSSB staff nurse syllabus'.</w:t>
       </w:r>
     </w:p>
     <w:p>
@@ -4879,7 +5083,7 @@
           <w:color w:val="00288E"/>
           <w:sz w:val="32"/>
         </w:rPr>
-        <w:t>7. Relational Database Architecture &amp; Data Dictionary</w:t>
+        <w:t>7. Cloud Database Architecture (Supabase / Managed PostgreSQL)</w:t>
       </w:r>
     </w:p>
     <w:p>
@@ -4892,7 +5096,7 @@
           <w:color w:val="334155"/>
           <w:sz w:val="20"/>
         </w:rPr>
-        <w:t>The database architecture is designed in MySQL 8.0 with InnoDB engine, utf8mb4 collation (supporting complex Gujarati characters and emojis), foreign key constraints, and performance indexes.</w:t>
+        <w:t>The database tier is architected on Supabase Cloud Infrastructure (powered by PostgreSQL 16). This enterprise cloud foundation eliminates traditional on-premise single-point-of-failure bottlenecks and guarantees 99.99% uptime during peak exam notification cycles.</w:t>
       </w:r>
     </w:p>
     <w:p>
@@ -4907,7 +5111,150 @@
           <w:color w:val="1565C0"/>
           <w:sz w:val="26"/>
         </w:rPr>
-        <w:t>7.1 Schema Definitions</w:t>
+        <w:t>7.1 Supabase Cloud Infrastructure &amp; Capabilities</w:t>
+      </w:r>
+    </w:p>
+    <w:p>
+      <w:pPr>
+        <w:spacing w:before="0" w:after="80" w:line="276" w:lineRule="auto"/>
+      </w:pPr>
+      <w:r>
+        <w:rPr>
+          <w:rFonts w:ascii="Arial" w:hAnsi="Arial"/>
+          <w:color w:val="334155"/>
+          <w:sz w:val="20"/>
+        </w:rPr>
+        <w:t>The Supabase Cloud platform provides critical enterprise primitives perfectly suited for citizen-scale government recruitment discovery:</w:t>
+      </w:r>
+    </w:p>
+    <w:p>
+      <w:pPr>
+        <w:pStyle w:val="ListBullet"/>
+        <w:spacing w:before="0" w:after="60" w:line="276" w:lineRule="auto"/>
+      </w:pPr>
+      <w:r>
+        <w:rPr>
+          <w:rFonts w:ascii="Arial" w:hAnsi="Arial"/>
+          <w:b/>
+          <w:color w:val="0F172A"/>
+          <w:sz w:val="20"/>
+        </w:rPr>
+        <w:t xml:space="preserve">1. High-Concurrency Connection Pooling: </w:t>
+      </w:r>
+      <w:r>
+        <w:rPr>
+          <w:rFonts w:ascii="Arial" w:hAnsi="Arial"/>
+          <w:color w:val="334155"/>
+          <w:sz w:val="20"/>
+        </w:rPr>
+        <w:t>Supabase utilizes Supavisor connection pooling (Ports 5432 / 6543) enabling thousands of concurrent candidate connections without PostgreSQL connection exhaustion during major bharti releases.</w:t>
+      </w:r>
+    </w:p>
+    <w:p>
+      <w:pPr>
+        <w:pStyle w:val="ListBullet"/>
+        <w:spacing w:before="0" w:after="60" w:line="276" w:lineRule="auto"/>
+      </w:pPr>
+      <w:r>
+        <w:rPr>
+          <w:rFonts w:ascii="Arial" w:hAnsi="Arial"/>
+          <w:b/>
+          <w:color w:val="0F172A"/>
+          <w:sz w:val="20"/>
+        </w:rPr>
+        <w:t xml:space="preserve">2. Cloud Object Storage Buckets: </w:t>
+      </w:r>
+      <w:r>
+        <w:rPr>
+          <w:rFonts w:ascii="Arial" w:hAnsi="Arial"/>
+          <w:color w:val="334155"/>
+          <w:sz w:val="20"/>
+        </w:rPr>
+        <w:t>S3-compatible global object storage buckets (`official-gazettes`, `syllabus-documents`, `candidate-resumes`) with integrated CDN acceleration for rapid PDF delivery.</w:t>
+      </w:r>
+    </w:p>
+    <w:p>
+      <w:pPr>
+        <w:pStyle w:val="ListBullet"/>
+        <w:spacing w:before="0" w:after="60" w:line="276" w:lineRule="auto"/>
+      </w:pPr>
+      <w:r>
+        <w:rPr>
+          <w:rFonts w:ascii="Arial" w:hAnsi="Arial"/>
+          <w:b/>
+          <w:color w:val="0F172A"/>
+          <w:sz w:val="20"/>
+        </w:rPr>
+        <w:t xml:space="preserve">3. Realtime Change Data Capture (CDC): </w:t>
+      </w:r>
+      <w:r>
+        <w:rPr>
+          <w:rFonts w:ascii="Arial" w:hAnsi="Arial"/>
+          <w:color w:val="334155"/>
+          <w:sz w:val="20"/>
+        </w:rPr>
+        <w:t>PostgreSQL Write-Ahead Log (WAL) hooks trigger instant webhooks whenever an admin publishes a new job or alters deadlines, triggering immediate background queue processing.</w:t>
+      </w:r>
+    </w:p>
+    <w:p>
+      <w:pPr>
+        <w:pStyle w:val="ListBullet"/>
+        <w:spacing w:before="0" w:after="60" w:line="276" w:lineRule="auto"/>
+      </w:pPr>
+      <w:r>
+        <w:rPr>
+          <w:rFonts w:ascii="Arial" w:hAnsi="Arial"/>
+          <w:b/>
+          <w:color w:val="0F172A"/>
+          <w:sz w:val="20"/>
+        </w:rPr>
+        <w:t xml:space="preserve">4. Row-Level Security (RLS): </w:t>
+      </w:r>
+      <w:r>
+        <w:rPr>
+          <w:rFonts w:ascii="Arial" w:hAnsi="Arial"/>
+          <w:color w:val="334155"/>
+          <w:sz w:val="20"/>
+        </w:rPr>
+        <w:t>Candidate profile records and alert logs are secured using database-level security policies (RLS), guaranteeing that candidate PII cannot be accessed across tenant boundaries.</w:t>
+      </w:r>
+    </w:p>
+    <w:p>
+      <w:pPr>
+        <w:pStyle w:val="ListBullet"/>
+        <w:spacing w:before="0" w:after="60" w:line="276" w:lineRule="auto"/>
+      </w:pPr>
+      <w:r>
+        <w:rPr>
+          <w:rFonts w:ascii="Arial" w:hAnsi="Arial"/>
+          <w:b/>
+          <w:color w:val="0F172A"/>
+          <w:sz w:val="20"/>
+        </w:rPr>
+        <w:t xml:space="preserve">5. Point-in-Time Recovery &amp; Backups: </w:t>
+      </w:r>
+      <w:r>
+        <w:rPr>
+          <w:rFonts w:ascii="Arial" w:hAnsi="Arial"/>
+          <w:color w:val="334155"/>
+          <w:sz w:val="20"/>
+        </w:rPr>
+        <w:t>Continuous WAL archiving with Point-in-Time Recovery (PITR) allowing instantaneous state rollback to any second within a 30-day window, coupled with automated daily encrypted backups.</w:t>
+      </w:r>
+    </w:p>
+    <w:p>
+      <w:pPr>
+        <w:keepNext/>
+        <w:spacing w:before="240" w:after="80"/>
+      </w:pPr>
+      <w:r>
+        <w:rPr>
+          <w:rFonts w:ascii="Arial" w:hAnsi="Arial"/>
+          <w:b/>
+          <w:color w:val="1565C0"/>
+          <w:sz w:val="26"/>
+        </w:rPr>
+        <w:t>7.2 Relational Data Dictionary (Supabase PostgreSQL)</w:t>
       </w:r>
     </w:p>
     <w:p>
@@ -5097,7 +5444,7 @@
                 <w:color w:val="1E293B"/>
                 <w:sz w:val="18"/>
               </w:rPr>
-              <w:t>BIGINT UNSIGNED</w:t>
+              <w:t>UUID</w:t>
             </w:r>
           </w:p>
         </w:tc>
@@ -5122,7 +5469,7 @@
                 <w:color w:val="1E293B"/>
                 <w:sz w:val="18"/>
               </w:rPr>
-              <w:t>PRIMARY KEY, AUTO_INCREMENT</w:t>
+              <w:t>PRIMARY KEY, DEFAULT gen_random_uuid()</w:t>
             </w:r>
           </w:p>
         </w:tc>
@@ -5147,7 +5494,7 @@
                 <w:color w:val="1E293B"/>
                 <w:sz w:val="18"/>
               </w:rPr>
-              <w:t>Unique internal user identifier</w:t>
+              <w:t>Unique candidate global identifier</w:t>
             </w:r>
           </w:p>
         </w:tc>
@@ -6423,7 +6770,7 @@
                 <w:color w:val="1E293B"/>
                 <w:sz w:val="18"/>
               </w:rPr>
-              <w:t>TIMESTAMP</w:t>
+              <w:t>TIMESTAMPTZ</w:t>
             </w:r>
           </w:p>
         </w:tc>
@@ -6448,7 +6795,7 @@
                 <w:color w:val="1E293B"/>
                 <w:sz w:val="18"/>
               </w:rPr>
-              <w:t>NOT NULL</w:t>
+              <w:t>DEFAULT NOW()</w:t>
             </w:r>
           </w:p>
         </w:tc>
@@ -6473,7 +6820,7 @@
                 <w:color w:val="1E293B"/>
                 <w:sz w:val="18"/>
               </w:rPr>
-              <w:t>Laravel audit timestamps</w:t>
+              <w:t>PostgreSQL audit timestamps with timezone</w:t>
             </w:r>
           </w:p>
         </w:tc>
@@ -6671,7 +7018,7 @@
                 <w:color w:val="1E293B"/>
                 <w:sz w:val="18"/>
               </w:rPr>
-              <w:t>BIGINT UNSIGNED</w:t>
+              <w:t>BIGINT GENERATED ALWAYS AS IDENTITY</w:t>
             </w:r>
           </w:p>
         </w:tc>
@@ -6696,7 +7043,7 @@
                 <w:color w:val="1E293B"/>
                 <w:sz w:val="18"/>
               </w:rPr>
-              <w:t>PRIMARY KEY, AUTO_INCREMENT</w:t>
+              <w:t>PRIMARY KEY</w:t>
             </w:r>
           </w:p>
         </w:tc>
@@ -7129,7 +7476,7 @@
                 <w:color w:val="1E293B"/>
                 <w:sz w:val="18"/>
               </w:rPr>
-              <w:t>SVG / WebP department emblem asset path</w:t>
+              <w:t>Supabase storage asset URL</w:t>
             </w:r>
           </w:p>
         </w:tc>
@@ -7429,7 +7776,7 @@
                 <w:color w:val="1E293B"/>
                 <w:sz w:val="18"/>
               </w:rPr>
-              <w:t>BIGINT UNSIGNED</w:t>
+              <w:t>BIGINT GENERATED ALWAYS AS IDENTITY</w:t>
             </w:r>
           </w:p>
         </w:tc>
@@ -7454,7 +7801,7 @@
                 <w:color w:val="1E293B"/>
                 <w:sz w:val="18"/>
               </w:rPr>
-              <w:t>PRIMARY KEY, AUTO_INCREMENT</w:t>
+              <w:t>PRIMARY KEY</w:t>
             </w:r>
           </w:p>
         </w:tc>
@@ -7837,7 +8184,7 @@
                 <w:color w:val="1E293B"/>
                 <w:sz w:val="18"/>
               </w:rPr>
-              <w:t>BIGINT UNSIGNED</w:t>
+              <w:t>BIGINT</w:t>
             </w:r>
           </w:p>
         </w:tc>
@@ -8041,7 +8388,7 @@
                 <w:color w:val="1E293B"/>
                 <w:sz w:val="18"/>
               </w:rPr>
-              <w:t>INT UNSIGNED</w:t>
+              <w:t>INT</w:t>
             </w:r>
           </w:p>
         </w:tc>
@@ -8245,7 +8592,7 @@
                 <w:color w:val="1E293B"/>
                 <w:sz w:val="18"/>
               </w:rPr>
-              <w:t>TINYINT UNSIGNED</w:t>
+              <w:t>SMALLINT</w:t>
             </w:r>
           </w:p>
         </w:tc>
@@ -8347,7 +8694,7 @@
                 <w:color w:val="1E293B"/>
                 <w:sz w:val="18"/>
               </w:rPr>
-              <w:t>DECIMAL(8,2)</w:t>
+              <w:t>NUMERIC(8,2)</w:t>
             </w:r>
           </w:p>
         </w:tc>
@@ -8449,7 +8796,7 @@
                 <w:color w:val="1E293B"/>
                 <w:sz w:val="18"/>
               </w:rPr>
-              <w:t>DATETIME</w:t>
+              <w:t>TIMESTAMPTZ</w:t>
             </w:r>
           </w:p>
         </w:tc>
@@ -8805,7 +9152,7 @@
                 <w:color w:val="1E293B"/>
                 <w:sz w:val="18"/>
               </w:rPr>
-              <w:t>Direct link to official government notification PDF</w:t>
+              <w:t>Direct link to official government notification PDF on Supabase Storage</w:t>
             </w:r>
           </w:p>
         </w:tc>
@@ -8857,7 +9204,7 @@
                 <w:color w:val="1E293B"/>
                 <w:sz w:val="18"/>
               </w:rPr>
-              <w:t>LONGTEXT</w:t>
+              <w:t>JSONB</w:t>
             </w:r>
           </w:p>
         </w:tc>
@@ -8907,7 +9254,7 @@
                 <w:color w:val="1E293B"/>
                 <w:sz w:val="18"/>
               </w:rPr>
-              <w:t>Structured JSON or markdown syllabus details</w:t>
+              <w:t>Structured JSON topic tree for examination breakdown</w:t>
             </w:r>
           </w:p>
         </w:tc>
@@ -9061,7 +9408,7 @@
                 <w:color w:val="1E293B"/>
                 <w:sz w:val="18"/>
               </w:rPr>
-              <w:t>BIGINT UNSIGNED</w:t>
+              <w:t>BIGINT</w:t>
             </w:r>
           </w:p>
         </w:tc>
@@ -9163,7 +9510,7 @@
                 <w:color w:val="1E293B"/>
                 <w:sz w:val="18"/>
               </w:rPr>
-              <w:t>BIGINT UNSIGNED</w:t>
+              <w:t>BIGINT</w:t>
             </w:r>
           </w:p>
         </w:tc>
@@ -9411,7 +9758,7 @@
                 <w:color w:val="1E293B"/>
                 <w:sz w:val="18"/>
               </w:rPr>
-              <w:t>BIGINT UNSIGNED</w:t>
+              <w:t>UUID</w:t>
             </w:r>
           </w:p>
         </w:tc>
@@ -9436,7 +9783,7 @@
                 <w:color w:val="1E293B"/>
                 <w:sz w:val="18"/>
               </w:rPr>
-              <w:t>PRIMARY KEY, AUTO_INCREMENT</w:t>
+              <w:t>PRIMARY KEY, DEFAULT gen_random_uuid()</w:t>
             </w:r>
           </w:p>
         </w:tc>
@@ -9513,7 +9860,7 @@
                 <w:color w:val="1E293B"/>
                 <w:sz w:val="18"/>
               </w:rPr>
-              <w:t>BIGINT UNSIGNED</w:t>
+              <w:t>UUID</w:t>
             </w:r>
           </w:p>
         </w:tc>
@@ -9615,7 +9962,7 @@
                 <w:color w:val="1E293B"/>
                 <w:sz w:val="18"/>
               </w:rPr>
-              <w:t>BIGINT UNSIGNED</w:t>
+              <w:t>BIGINT</w:t>
             </w:r>
           </w:p>
         </w:tc>
@@ -9819,7 +10166,7 @@
                 <w:color w:val="1E293B"/>
                 <w:sz w:val="18"/>
               </w:rPr>
-              <w:t>DATETIME</w:t>
+              <w:t>TIMESTAMPTZ</w:t>
             </w:r>
           </w:p>
         </w:tc>
@@ -9921,7 +10268,7 @@
                 <w:color w:val="1E293B"/>
                 <w:sz w:val="18"/>
               </w:rPr>
-              <w:t>DATETIME</w:t>
+              <w:t>TIMESTAMPTZ</w:t>
             </w:r>
           </w:p>
         </w:tc>
@@ -10169,7 +10516,7 @@
                 <w:color w:val="1E293B"/>
                 <w:sz w:val="18"/>
               </w:rPr>
-              <w:t>BIGINT UNSIGNED</w:t>
+              <w:t>UUID</w:t>
             </w:r>
           </w:p>
         </w:tc>
@@ -10194,7 +10541,7 @@
                 <w:color w:val="1E293B"/>
                 <w:sz w:val="18"/>
               </w:rPr>
-              <w:t>PRIMARY KEY, AUTO_INCREMENT</w:t>
+              <w:t>PRIMARY KEY, DEFAULT gen_random_uuid()</w:t>
             </w:r>
           </w:p>
         </w:tc>
@@ -10271,7 +10618,7 @@
                 <w:color w:val="1E293B"/>
                 <w:sz w:val="18"/>
               </w:rPr>
-              <w:t>BIGINT UNSIGNED</w:t>
+              <w:t>UUID</w:t>
             </w:r>
           </w:p>
         </w:tc>
@@ -10373,7 +10720,7 @@
                 <w:color w:val="1E293B"/>
                 <w:sz w:val="18"/>
               </w:rPr>
-              <w:t>BIGINT UNSIGNED</w:t>
+              <w:t>BIGINT</w:t>
             </w:r>
           </w:p>
         </w:tc>
@@ -10985,7 +11332,7 @@
                 <w:color w:val="1E293B"/>
                 <w:sz w:val="18"/>
               </w:rPr>
-              <w:t>DATETIME</w:t>
+              <w:t>TIMESTAMPTZ</w:t>
             </w:r>
           </w:p>
         </w:tc>
@@ -11376,7 +11723,7 @@
           <w:color w:val="00288E"/>
           <w:sz w:val="32"/>
         </w:rPr>
-        <w:t>9. Phased Implementation Roadmap &amp; Build Milestones</w:t>
+        <w:t>9. Phased Implementation Roadmap &amp; Enterprise Build Milestones</w:t>
       </w:r>
     </w:p>
     <w:p>
@@ -11389,7 +11736,7 @@
           <w:color w:val="334155"/>
           <w:sz w:val="20"/>
         </w:rPr>
-        <w:t>The production deployment is structured into five agile build milestones:</w:t>
+        <w:t>To ensure rigorous enterprise quality, automated security audits, and flawless high-load scalability, the project execution is structured across a realistic 8 to 10 week development roadmap (56 to 66 Days):</w:t>
       </w:r>
     </w:p>
     <w:tbl>
@@ -11479,7 +11826,7 @@
                 <w:color w:val="FFFFFF"/>
                 <w:sz w:val="19"/>
               </w:rPr>
-              <w:t>Duration</w:t>
+              <w:t>Timeline / Days</w:t>
             </w:r>
           </w:p>
         </w:tc>
@@ -11557,7 +11904,7 @@
                 <w:color w:val="1E293B"/>
                 <w:sz w:val="18"/>
               </w:rPr>
-              <w:t>Environment setup, Laravel 11 + Breeze scaffolding, MySQL migrations, Tailwind design tokens, RBAC roles.</w:t>
+              <w:t>Core Environment, Supabase Cloud Database setup, PostgreSQL schemas, Supabase Storage buckets, Laravel 11 + Breeze scaffolding, Spatie RBAC, and Tailwind light theme token foundation.</w:t>
             </w:r>
           </w:p>
         </w:tc>
@@ -11582,7 +11929,7 @@
                 <w:color w:val="1E293B"/>
                 <w:sz w:val="18"/>
               </w:rPr>
-              <w:t>3 Days</w:t>
+              <w:t>10 - 12 Days</w:t>
             </w:r>
           </w:p>
         </w:tc>
@@ -11607,7 +11954,7 @@
                 <w:color w:val="1E293B"/>
                 <w:sz w:val="18"/>
               </w:rPr>
-              <w:t>Staging environment deployed; auth functional.</w:t>
+              <w:t>Supabase PostgreSQL connected; candidate auth and administrative roles operational on staging.</w:t>
             </w:r>
           </w:p>
         </w:tc>
@@ -11659,7 +12006,7 @@
                 <w:color w:val="1E293B"/>
                 <w:sz w:val="18"/>
               </w:rPr>
-              <w:t>Departments &amp; Jobs CRUD admin, Public Home &amp; Listing UI templates, bilingual Gujarati text rendering.</w:t>
+              <w:t>Departments &amp; Jobs CRUD administrative engine, Supabase Realtime event listeners, Public Home &amp; All Jobs listing responsive templates, and bilingual Gujarati typography pipeline.</w:t>
             </w:r>
           </w:p>
         </w:tc>
@@ -11684,7 +12031,7 @@
                 <w:color w:val="1E293B"/>
                 <w:sz w:val="18"/>
               </w:rPr>
-              <w:t>4 Days</w:t>
+              <w:t>14 - 16 Days</w:t>
             </w:r>
           </w:p>
         </w:tc>
@@ -11709,7 +12056,7 @@
                 <w:color w:val="1E293B"/>
                 <w:sz w:val="18"/>
               </w:rPr>
-              <w:t>Full administrative job entry &amp; public cards live.</w:t>
+              <w:t>Full administrative job ingestion, image/PDF upload to Supabase Storage, and public recruitment cards live.</w:t>
             </w:r>
           </w:p>
         </w:tc>
@@ -11761,7 +12108,7 @@
                 <w:color w:val="1E293B"/>
                 <w:sz w:val="18"/>
               </w:rPr>
-              <w:t>Candidate profile dashboard, saved jobs, live Livewire search filters, Instant Eligibility calculation engine.</w:t>
+              <w:t>Candidate SSO profile hub, bookmarked jobs sync, reactive Livewire 3 search and multi-facet filtering, and the Instant 30-Second Eligibility validation calculation engine.</w:t>
             </w:r>
           </w:p>
         </w:tc>
@@ -11786,7 +12133,7 @@
                 <w:color w:val="1E293B"/>
                 <w:sz w:val="18"/>
               </w:rPr>
-              <w:t>3 Days</w:t>
+              <w:t>10 - 12 Days</w:t>
             </w:r>
           </w:p>
         </w:tc>
@@ -11811,7 +12158,7 @@
                 <w:color w:val="1E293B"/>
                 <w:sz w:val="18"/>
               </w:rPr>
-              <w:t>Interactive eligibility calculator verified with test cases.</w:t>
+              <w:t>Eligibility checker verified with 50+ age/education test cases; instant Livewire filters operational.</w:t>
             </w:r>
           </w:p>
         </w:tc>
@@ -11863,7 +12210,7 @@
                 <w:color w:val="1E293B"/>
                 <w:sz w:val="18"/>
               </w:rPr>
-              <w:t>WhatsApp Business API integration, Brevo SMTP mailers, scheduled cron workers for deadline reminders.</w:t>
+              <w:t>WhatsApp Cloud Business API integration, Brevo SMTP transactional mailers, Supabase Webhook event queue, and daily automated 08:00 AM cron workers for 72h/24h deadline reminders.</w:t>
             </w:r>
           </w:p>
         </w:tc>
@@ -11888,7 +12235,7 @@
                 <w:color w:val="1E293B"/>
                 <w:sz w:val="18"/>
               </w:rPr>
-              <w:t>4 Days</w:t>
+              <w:t>12 - 14 Days</w:t>
             </w:r>
           </w:p>
         </w:tc>
@@ -11913,7 +12260,7 @@
                 <w:color w:val="1E293B"/>
                 <w:sz w:val="18"/>
               </w:rPr>
-              <w:t>Automated alert dispatch &amp; delivery logs tested.</w:t>
+              <w:t>Automated alert dispatch verified; delivery status logs and candidate opt-in toggles functional.</w:t>
             </w:r>
           </w:p>
         </w:tc>
@@ -11965,7 +12312,7 @@
                 <w:color w:val="1E293B"/>
                 <w:sz w:val="18"/>
               </w:rPr>
-              <w:t>Results/Call Letters index, SEO meta tags, sitemap.xml, Cloudflare CDN caching, final security audit &amp; launch.</w:t>
+              <w:t>Results &amp; Call Letters index, SEO vernacular meta tags, sitemap.xml, Cloudflare Enterprise CDN caching, security penetration audit, stress load testing, and production deployment.</w:t>
             </w:r>
           </w:p>
         </w:tc>
@@ -11990,7 +12337,7 @@
                 <w:color w:val="1E293B"/>
                 <w:sz w:val="18"/>
               </w:rPr>
-              <w:t>3 Days</w:t>
+              <w:t>10 - 12 Days</w:t>
             </w:r>
           </w:p>
         </w:tc>
@@ -12015,7 +12362,64 @@
                 <w:color w:val="1E293B"/>
                 <w:sz w:val="18"/>
               </w:rPr>
-              <w:t>Production live on domain with SSL &amp; 100% uptime.</w:t>
+              <w:t>Production live on custom domain with SSL, edge caching active, 99.99% uptime benchmark achieved.</w:t>
+            </w:r>
+          </w:p>
+        </w:tc>
+      </w:tr>
+    </w:tbl>
+    <w:p>
+      <w:pPr>
+        <w:spacing w:after="80"/>
+      </w:pPr>
+    </w:p>
+    <w:tbl>
+      <w:tblPr>
+        <w:tblW w:type="auto" w:w="0"/>
+        <w:jc w:val="center"/>
+        <w:tblLook w:firstColumn="1" w:firstRow="1" w:lastColumn="0" w:lastRow="0" w:noHBand="0" w:noVBand="1" w:val="04A0"/>
+      </w:tblPr>
+      <w:tblGrid>
+        <w:gridCol w:w="9360"/>
+      </w:tblGrid>
+      <w:tr>
+        <w:tc>
+          <w:tcPr>
+            <w:tcW w:type="dxa" w:w="9360"/>
+            <w:shd w:fill="F0F4F8"/>
+            <w:tcMar>
+              <w:top w:w="120" w:type="dxa"/>
+              <w:bottom w:w="120" w:type="dxa"/>
+              <w:left w:w="180" w:type="dxa"/>
+              <w:right w:w="180" w:type="dxa"/>
+            </w:tcMar>
+            <w:tcBorders>
+              <w:left w:val="single" w:sz="24" w:space="0" w:color="00288E"/>
+              <w:top w:val="none"/>
+              <w:right w:val="none"/>
+              <w:bottom w:val="none"/>
+            </w:tcBorders>
+          </w:tcPr>
+          <w:p>
+            <w:pPr>
+              <w:spacing w:before="40" w:after="40" w:line="276" w:lineRule="auto"/>
+            </w:pPr>
+            <w:r>
+              <w:rPr>
+                <w:rFonts w:ascii="Arial" w:hAnsi="Arial"/>
+                <w:b/>
+                <w:color w:val="00288E"/>
+                <w:sz w:val="20"/>
+              </w:rPr>
+              <w:t xml:space="preserve">📌 PROJECT DURATION &amp; QUALITY ASSURANCE: </w:t>
+            </w:r>
+            <w:r>
+              <w:rPr>
+                <w:rFonts w:ascii="Arial" w:hAnsi="Arial"/>
+                <w:color w:val="1E293B"/>
+                <w:sz w:val="19"/>
+              </w:rPr>
+              <w:t>Total Projected Project Duration: 56 to 66 Days (Approx. 8 to 10 Weeks). This extended, realistic timeline accommodates end-to-end cloud database security configurations, bilingual font rendering audits, WhatsApp Business API template approvals, and exhaustive cross-device mobile testing across budget Android smartphones.</w:t>
             </w:r>
           </w:p>
         </w:tc>

</xml_diff>